<commit_message>
Chapter 1 data guide: Step 3 grouping stated exactly; old-map contrast marked raw
Co-Authored-By: Claude Fable 5.1 <noreply@anthropic.com>
Claude-Session: https://claude.ai/code/session_01Etfh8cE52MJVMdSwWX1R6h
</commit_message>
<xml_diff>
--- a/book-data/ch1-agjr/ch1-agjr-data-guide.docx
+++ b/book-data/ch1-agjr/ch1-agjr-data-guide.docx
@@ -1879,7 +1879,7 @@
               <w:rPr>
                 <w:sz w:val="19"/>
               </w:rPr>
-              <w:t>median agency count with five or more crown employees in 1794, and with fewer</w:t>
+              <w:t>median agency count with five or more crown employees in 1794, and with fewer (a raw contrast; most of the staffed towns are cities)</w:t>
             </w:r>
           </w:p>
         </w:tc>
@@ -1923,7 +1923,7 @@
               <w:rPr>
                 <w:sz w:val="19"/>
               </w:rPr>
-              <w:t>average crown_employees_1794 over each municipality’s neighbors; municipalities with no staffed neighbor as one group, the rest in thirds</w:t>
+              <w:t>average crown_employees_1794 over all of each municipality’s neighbors; municipalities with no neighbor that had any crown employee as one group, the rest in thirds by that average</w:t>
             </w:r>
           </w:p>
         </w:tc>
@@ -1937,7 +1937,7 @@
               <w:rPr>
                 <w:sz w:val="19"/>
               </w:rPr>
-              <w:t>no staffed neighbor: n = 344, median agencies 10, mean not_poor 56.3; thirds: median agencies 10, 10, 11; mean not_poor 56.1, 54.9, 58.3</w:t>
+              <w:t>no such neighbor: n = 344, median agencies 10, mean not_poor 56.3; thirds: median agencies 10, 10, 11; mean not_poor 56.1, 54.9, 58.3 (to one decimal, thirds may split ties differently by tool: 55.0 is also right)</w:t>
             </w:r>
           </w:p>
         </w:tc>

</xml_diff>